<commit_message>
add authentication server side for audit log - Neon db limit reached - TODO still to add server side for other functionality
</commit_message>
<xml_diff>
--- a/_word/chargingstationsapp DEMO.docx
+++ b/_word/chargingstationsapp DEMO.docx
@@ -4,12 +4,64 @@
   <w:body>
     <w:p>
       <w:r>
-        <w:t>Dit is een DEMO om de mogelijkheden van GHCP te tonen, geen productie versie!</w:t>
-      </w:r>
-    </w:p>
-    <w:p>
-      <w:r>
-        <w:t>// AI programmeer-maatje</w:t>
+        <w:t xml:space="preserve">Dit is een </w:t>
+      </w:r>
+      <w:r>
+        <w:rPr>
+          <w:b/>
+          <w:bCs/>
+        </w:rPr>
+        <w:t>DEMO</w:t>
+      </w:r>
+      <w:r>
+        <w:t xml:space="preserve"> om de mogelijkheden van GHCP te tonen, geen productie versie!</w:t>
+      </w:r>
+      <w:r>
+        <w:t xml:space="preserve"> </w:t>
+      </w:r>
+      <w:r>
+        <w:rPr>
+          <w:b/>
+          <w:bCs/>
+        </w:rPr>
+        <w:t>Voobeeld</w:t>
+      </w:r>
+      <w:r>
+        <w:t xml:space="preserve"> app, dinsdag aan begonnen</w:t>
+      </w:r>
+    </w:p>
+    <w:p>
+      <w:r>
+        <w:rPr>
+          <w:b/>
+          <w:bCs/>
+        </w:rPr>
+        <w:t>30/3</w:t>
+      </w:r>
+      <w:r>
+        <w:t xml:space="preserve"> competence meeting 10min praten hierover, wat is meest </w:t>
+      </w:r>
+      <w:r>
+        <w:rPr>
+          <w:b/>
+          <w:bCs/>
+        </w:rPr>
+        <w:t>nuttig</w:t>
+      </w:r>
+      <w:r>
+        <w:t xml:space="preserve"> (met Leon &amp; Gunther)</w:t>
+      </w:r>
+    </w:p>
+    <w:p>
+      <w:r>
+        <w:t xml:space="preserve">// </w:t>
+      </w:r>
+      <w:r>
+        <w:rPr>
+          <w:b/>
+          <w:bCs/>
+        </w:rPr>
+        <w:t>AI programmeer-maatje</w:t>
       </w:r>
       <w:r>
         <w:t xml:space="preserve">, zin om terug te bouwen en </w:t>
@@ -49,15 +101,45 @@
         <w:t xml:space="preserve">a </w:t>
       </w:r>
       <w:r>
-        <w:t>greenfield app)</w:t>
-      </w:r>
-    </w:p>
-    <w:p>
-      <w:r>
+        <w:rPr>
+          <w:b/>
+          <w:bCs/>
+        </w:rPr>
+        <w:t>greenfield</w:t>
+      </w:r>
+      <w:r>
+        <w:t xml:space="preserve"> app)</w:t>
+      </w:r>
+    </w:p>
+    <w:p>
+      <w:r>
+        <w:rPr>
+          <w:b/>
+          <w:bCs/>
+        </w:rPr>
+        <w:t>Instructions</w:t>
+      </w:r>
+      <w:r>
+        <w:t xml:space="preserve"> – AGENTS.md and .github/instructions/*.md files with description</w:t>
+      </w:r>
+    </w:p>
+    <w:p>
+      <w:r>
+        <w:rPr>
+          <w:b/>
+          <w:bCs/>
+        </w:rPr>
         <w:t xml:space="preserve">Iterative </w:t>
       </w:r>
       <w:r>
-        <w:t xml:space="preserve">&amp; self learning way </w:t>
+        <w:rPr>
+          <w:b/>
+          <w:bCs/>
+        </w:rPr>
+        <w:t>&amp; self learning</w:t>
+      </w:r>
+      <w:r>
+        <w:t xml:space="preserve"> way </w:t>
       </w:r>
       <w:r>
         <w:t xml:space="preserve"> (MD files)</w:t>
@@ -65,10 +147,63 @@
       <w:r>
         <w:t xml:space="preserve"> – context is king</w:t>
       </w:r>
-    </w:p>
-    <w:p>
-      <w:r>
-        <w:t>Ask, Plan, Agent mode – different models and GHCP versions</w:t>
+      <w:r>
+        <w:t xml:space="preserve"> (</w:t>
+      </w:r>
+      <w:r>
+        <w:t>cursor and open tabs</w:t>
+      </w:r>
+      <w:r>
+        <w:t>)</w:t>
+      </w:r>
+      <w:r>
+        <w:t xml:space="preserve"> – together with instructions files</w:t>
+      </w:r>
+    </w:p>
+    <w:p>
+      <w:r>
+        <w:t xml:space="preserve">Ask, Plan, Agent </w:t>
+      </w:r>
+      <w:r>
+        <w:rPr>
+          <w:b/>
+          <w:bCs/>
+        </w:rPr>
+        <w:t>mod</w:t>
+      </w:r>
+      <w:r>
+        <w:rPr>
+          <w:b/>
+          <w:bCs/>
+        </w:rPr>
+        <w:t>s</w:t>
+      </w:r>
+      <w:r>
+        <w:rPr>
+          <w:b/>
+          <w:bCs/>
+        </w:rPr>
+        <w:t>e</w:t>
+      </w:r>
+      <w:r>
+        <w:t xml:space="preserve"> – different </w:t>
+      </w:r>
+      <w:r>
+        <w:rPr>
+          <w:b/>
+          <w:bCs/>
+        </w:rPr>
+        <w:t>models</w:t>
+      </w:r>
+      <w:r>
+        <w:t xml:space="preserve"> and GHCP </w:t>
+      </w:r>
+      <w:r>
+        <w:rPr>
+          <w:b/>
+          <w:bCs/>
+        </w:rPr>
+        <w:t>versions</w:t>
       </w:r>
     </w:p>
     <w:p>
@@ -397,7 +532,10 @@
         </w:numPr>
       </w:pPr>
       <w:r>
-        <w:t xml:space="preserve">&gt;&gt; </w:t>
+        <w:t xml:space="preserve">Ok </w:t>
+      </w:r>
+      <w:r>
+        <w:t xml:space="preserve"> </w:t>
       </w:r>
       <w:r>
         <w:tab/>
@@ -413,7 +551,7 @@
         </w:numPr>
       </w:pPr>
       <w:r>
-        <w:t>&gt;&gt;</w:t>
+        <w:t xml:space="preserve">Ok </w:t>
       </w:r>
       <w:r>
         <w:tab/>
@@ -428,6 +566,13 @@
           <w:numId w:val="1"/>
         </w:numPr>
       </w:pPr>
+      <w:r>
+        <w:t xml:space="preserve">Ok </w:t>
+      </w:r>
+      <w:r>
+        <w:tab/>
+        <w:t>add new tests everywhere but do not fix existing ones!</w:t>
+      </w:r>
     </w:p>
     <w:p>
       <w:pPr>
@@ -438,6 +583,12 @@
         </w:numPr>
       </w:pPr>
       <w:r>
+        <w:t xml:space="preserve">Ok </w:t>
+      </w:r>
+      <w:r>
+        <w:tab/>
+      </w:r>
+      <w:r>
         <w:t>CI/CD</w:t>
       </w:r>
       <w:r>
@@ -451,6 +602,9 @@
       </w:r>
       <w:r>
         <w:t>?</w:t>
+      </w:r>
+      <w:r>
+        <w:t xml:space="preserve"> -&gt; local</w:t>
       </w:r>
     </w:p>
     <w:p>
@@ -461,21 +615,6 @@
           <w:numId w:val="1"/>
         </w:numPr>
       </w:pPr>
-      <w:r>
-        <w:t>Refactor</w:t>
-      </w:r>
-      <w:r>
-        <w:t xml:space="preserve">, cleanup ded code, </w:t>
-      </w:r>
-      <w:r>
-        <w:t>incl tests</w:t>
-      </w:r>
-      <w:r>
-        <w:t>, with safety net</w:t>
-      </w:r>
-      <w:r>
-        <w:t xml:space="preserve"> + MD</w:t>
-      </w:r>
     </w:p>
     <w:p>
       <w:pPr>
@@ -486,7 +625,25 @@
         </w:numPr>
       </w:pPr>
       <w:r>
-        <w:t>Scripts organization, cq how to rerun (migrations table – migration tracking)</w:t>
+        <w:t>Refactor</w:t>
+      </w:r>
+      <w:r>
+        <w:t>, cleanup de</w:t>
+      </w:r>
+      <w:r>
+        <w:t>a</w:t>
+      </w:r>
+      <w:r>
+        <w:t xml:space="preserve">d code, </w:t>
+      </w:r>
+      <w:r>
+        <w:t>incl tests</w:t>
+      </w:r>
+      <w:r>
+        <w:t>, with safety net</w:t>
+      </w:r>
+      <w:r>
+        <w:t xml:space="preserve"> + MD</w:t>
       </w:r>
     </w:p>
     <w:p>
@@ -498,7 +655,7 @@
         </w:numPr>
       </w:pPr>
       <w:r>
-        <w:t>Make it work in all time zones, look at the browser time and save in common zone (utc)</w:t>
+        <w:t>Scripts organization, cq how to rerun (migrations table – migration tracking)</w:t>
       </w:r>
     </w:p>
     <w:p>
@@ -510,7 +667,7 @@
         </w:numPr>
       </w:pPr>
       <w:r>
-        <w:t>MySQL instead of Neon Postgres</w:t>
+        <w:t>Make it work in all time zones, look at the browser time and save in common zone (utc)</w:t>
       </w:r>
     </w:p>
     <w:p>
@@ -522,6 +679,18 @@
         </w:numPr>
       </w:pPr>
       <w:r>
+        <w:t>MySQL instead of Neon Postgres</w:t>
+      </w:r>
+    </w:p>
+    <w:p>
+      <w:pPr>
+        <w:pStyle w:val="ListParagraph"/>
+        <w:numPr>
+          <w:ilvl w:val="0"/>
+          <w:numId w:val="1"/>
+        </w:numPr>
+      </w:pPr>
+      <w:r>
         <w:t>SCA, SAST, SAST</w:t>
       </w:r>
     </w:p>
@@ -543,7 +712,10 @@
     <w:p/>
     <w:p>
       <w:r>
-        <w:t>Om te gaan gebruiken, grootste obstakels is</w:t>
+        <w:t xml:space="preserve">grootste obstakels </w:t>
+      </w:r>
+      <w:r>
+        <w:t>om dgl app in test/prod te krijgen</w:t>
       </w:r>
     </w:p>
     <w:p>
@@ -592,20 +764,15 @@
           <w:ilvl w:val="0"/>
           <w:numId w:val="2"/>
         </w:numPr>
-      </w:pPr>
-      <w:r>
-        <w:t>no own BFF and no vault</w:t>
-      </w:r>
-    </w:p>
-    <w:p/>
-    <w:p>
-      <w:pPr>
         <w:rPr>
           <w:b/>
           <w:bCs/>
           <w:lang w:val="en-BE"/>
         </w:rPr>
       </w:pPr>
+      <w:r>
+        <w:t>no own BFF and no vault</w:t>
+      </w:r>
       <w:r>
         <w:rPr>
           <w:b/>

</xml_diff>